<commit_message>
feat: add employee and construction site registration
</commit_message>
<xml_diff>
--- a/Documentacion_Requisitos_Spring_Boot.docx
+++ b/Documentacion_Requisitos_Spring_Boot.docx
@@ -1181,6 +1181,433 @@
         <w:t>run_spring_boot_app.bat inicia Docker Desktop si hace falta, ejecuta docker compose up -d --build, espera a /api/health y muestra el link del frontend. stop_spring_boot_app.bat ejecuta docker compose down para cerrar la API, RabbitMQ y la red del proyecto.</w:t>
       </w:r>
     </w:p>
+    <w:p>
+      <w:r>
+        <w:br w:type="page"/>
+      </w:r>
+    </w:p>
+    <w:p>
+      <w:pPr>
+        <w:pStyle w:val="Heading1"/>
+      </w:pPr>
+      <w:r>
+        <w:t>7. Alta de empleados y sitios de construccion</w:t>
+      </w:r>
+    </w:p>
+    <w:p>
+      <w:r>
+        <w:t>Se agregaron dos operaciones nuevas al mismo sistema de modulos: Register Construction Site y Register Employee. Ambas aparecen en el selector Query de la pagina despues del login y se ejecutan mediante el endpoint /api/queries/{queryName}.</w:t>
+      </w:r>
+    </w:p>
+    <w:tbl>
+      <w:tblPr>
+        <w:tblStyle w:val="TableGrid"/>
+        <w:tblW w:type="auto" w:w="0"/>
+        <w:jc w:val="center"/>
+        <w:tblLook w:firstColumn="1" w:firstRow="1" w:lastColumn="0" w:lastRow="0" w:noHBand="0" w:noVBand="1" w:val="04A0"/>
+      </w:tblPr>
+      <w:tblGrid>
+        <w:gridCol w:w="3408"/>
+        <w:gridCol w:w="3408"/>
+        <w:gridCol w:w="3408"/>
+      </w:tblGrid>
+      <w:tr>
+        <w:tc>
+          <w:tcPr>
+            <w:tcW w:type="dxa" w:w="3408"/>
+            <w:shd w:fill="3F3A72"/>
+            <w:tcMar>
+              <w:top w:w="120" w:type="dxa"/>
+              <w:start w:w="120" w:type="dxa"/>
+              <w:bottom w:w="120" w:type="dxa"/>
+              <w:end w:w="120" w:type="dxa"/>
+            </w:tcMar>
+          </w:tcPr>
+          <w:p>
+            <w:r>
+              <w:rPr>
+                <w:color w:val="FFFFFF"/>
+              </w:rPr>
+              <w:t>Alta</w:t>
+            </w:r>
+          </w:p>
+        </w:tc>
+        <w:tc>
+          <w:tcPr>
+            <w:tcW w:type="dxa" w:w="3408"/>
+            <w:shd w:fill="3F3A72"/>
+            <w:tcMar>
+              <w:top w:w="120" w:type="dxa"/>
+              <w:start w:w="120" w:type="dxa"/>
+              <w:bottom w:w="120" w:type="dxa"/>
+              <w:end w:w="120" w:type="dxa"/>
+            </w:tcMar>
+          </w:tcPr>
+          <w:p>
+            <w:r>
+              <w:rPr>
+                <w:color w:val="FFFFFF"/>
+              </w:rPr>
+              <w:t>Archivo donde se agrego</w:t>
+            </w:r>
+          </w:p>
+        </w:tc>
+        <w:tc>
+          <w:tcPr>
+            <w:tcW w:type="dxa" w:w="3408"/>
+            <w:shd w:fill="3F3A72"/>
+            <w:tcMar>
+              <w:top w:w="120" w:type="dxa"/>
+              <w:start w:w="120" w:type="dxa"/>
+              <w:bottom w:w="120" w:type="dxa"/>
+              <w:end w:w="120" w:type="dxa"/>
+            </w:tcMar>
+          </w:tcPr>
+          <w:p>
+            <w:r>
+              <w:rPr>
+                <w:color w:val="FFFFFF"/>
+              </w:rPr>
+              <w:t>Como funciona</w:t>
+            </w:r>
+          </w:p>
+        </w:tc>
+      </w:tr>
+      <w:tr>
+        <w:tc>
+          <w:tcPr>
+            <w:tcW w:type="dxa" w:w="3408"/>
+            <w:tcMar>
+              <w:top w:w="120" w:type="dxa"/>
+              <w:start w:w="120" w:type="dxa"/>
+              <w:bottom w:w="120" w:type="dxa"/>
+              <w:end w:w="120" w:type="dxa"/>
+            </w:tcMar>
+            <w:vAlign w:val="center"/>
+          </w:tcPr>
+          <w:p>
+            <w:r>
+              <w:t>Sitio de construccion</w:t>
+            </w:r>
+          </w:p>
+        </w:tc>
+        <w:tc>
+          <w:tcPr>
+            <w:tcW w:type="dxa" w:w="3408"/>
+            <w:tcMar>
+              <w:top w:w="120" w:type="dxa"/>
+              <w:start w:w="120" w:type="dxa"/>
+              <w:bottom w:w="120" w:type="dxa"/>
+              <w:end w:w="120" w:type="dxa"/>
+            </w:tcMar>
+            <w:vAlign w:val="center"/>
+          </w:tcPr>
+          <w:p>
+            <w:r>
+              <w:t>src/main/resources/static/index.html y QueryService.java</w:t>
+            </w:r>
+          </w:p>
+        </w:tc>
+        <w:tc>
+          <w:tcPr>
+            <w:tcW w:type="dxa" w:w="3408"/>
+            <w:tcMar>
+              <w:top w:w="120" w:type="dxa"/>
+              <w:start w:w="120" w:type="dxa"/>
+              <w:bottom w:w="120" w:type="dxa"/>
+              <w:end w:w="120" w:type="dxa"/>
+            </w:tcMar>
+            <w:vAlign w:val="center"/>
+          </w:tcPr>
+          <w:p>
+            <w:r>
+              <w:t>El frontend muestra campos del sitio y el backend inserta en ConstructionSite.</w:t>
+            </w:r>
+          </w:p>
+        </w:tc>
+      </w:tr>
+      <w:tr>
+        <w:tc>
+          <w:tcPr>
+            <w:tcW w:type="dxa" w:w="3408"/>
+            <w:tcMar>
+              <w:top w:w="120" w:type="dxa"/>
+              <w:start w:w="120" w:type="dxa"/>
+              <w:bottom w:w="120" w:type="dxa"/>
+              <w:end w:w="120" w:type="dxa"/>
+            </w:tcMar>
+            <w:vAlign w:val="center"/>
+          </w:tcPr>
+          <w:p>
+            <w:r>
+              <w:t>Empleado</w:t>
+            </w:r>
+          </w:p>
+        </w:tc>
+        <w:tc>
+          <w:tcPr>
+            <w:tcW w:type="dxa" w:w="3408"/>
+            <w:tcMar>
+              <w:top w:w="120" w:type="dxa"/>
+              <w:start w:w="120" w:type="dxa"/>
+              <w:bottom w:w="120" w:type="dxa"/>
+              <w:end w:w="120" w:type="dxa"/>
+            </w:tcMar>
+            <w:vAlign w:val="center"/>
+          </w:tcPr>
+          <w:p>
+            <w:r>
+              <w:t>src/main/resources/static/index.html y QueryService.java</w:t>
+            </w:r>
+          </w:p>
+        </w:tc>
+        <w:tc>
+          <w:tcPr>
+            <w:tcW w:type="dxa" w:w="3408"/>
+            <w:tcMar>
+              <w:top w:w="120" w:type="dxa"/>
+              <w:start w:w="120" w:type="dxa"/>
+              <w:bottom w:w="120" w:type="dxa"/>
+              <w:end w:w="120" w:type="dxa"/>
+            </w:tcMar>
+            <w:vAlign w:val="center"/>
+          </w:tcPr>
+          <w:p>
+            <w:r>
+              <w:t>El frontend muestra campos del empleado y el backend inserta en Employees. Los campos opcionales se guardan como null si van vacios.</w:t>
+            </w:r>
+          </w:p>
+        </w:tc>
+      </w:tr>
+    </w:tbl>
+    <w:p>
+      <w:r>
+        <w:t>En la interfaz se agregaron las opciones dentro de los modulos Construction Sites y Employees. Esto permite usar la misma pantalla de Query, campos dinamicos, Run Query y Results.</w:t>
+      </w:r>
+    </w:p>
+    <w:p>
+      <w:pPr>
+        <w:jc w:val="center"/>
+      </w:pPr>
+      <w:r>
+        <w:drawing>
+          <wp:inline xmlns:a="http://schemas.openxmlformats.org/drawingml/2006/main" xmlns:pic="http://schemas.openxmlformats.org/drawingml/2006/picture">
+            <wp:extent cx="5897880" cy="6972644"/>
+            <wp:docPr id="11" name="Picture 11"/>
+            <wp:cNvGraphicFramePr>
+              <a:graphicFrameLocks noChangeAspect="1"/>
+            </wp:cNvGraphicFramePr>
+            <a:graphic>
+              <a:graphicData uri="http://schemas.openxmlformats.org/drawingml/2006/picture">
+                <pic:pic>
+                  <pic:nvPicPr>
+                    <pic:cNvPr id="0" name="src_main_resources_static_index_html_421_494.png"/>
+                    <pic:cNvPicPr/>
+                  </pic:nvPicPr>
+                  <pic:blipFill>
+                    <a:blip r:embed="rId19"/>
+                    <a:stretch>
+                      <a:fillRect/>
+                    </a:stretch>
+                  </pic:blipFill>
+                  <pic:spPr>
+                    <a:xfrm>
+                      <a:off x="0" y="0"/>
+                      <a:ext cx="5897880" cy="6972644"/>
+                    </a:xfrm>
+                    <a:prstGeom prst="rect"/>
+                  </pic:spPr>
+                </pic:pic>
+              </a:graphicData>
+            </a:graphic>
+          </wp:inline>
+        </w:drawing>
+      </w:r>
+    </w:p>
+    <w:p>
+      <w:pPr>
+        <w:jc w:val="center"/>
+      </w:pPr>
+      <w:r>
+        <w:rPr>
+          <w:i/>
+          <w:color w:val="5B6778"/>
+          <w:sz w:val="18"/>
+        </w:rPr>
+        <w:t>Figura 11. La interfaz agrega Register Construction Site y Register Employee en los modulos.</w:t>
+      </w:r>
+    </w:p>
+    <w:p>
+      <w:r>
+        <w:t>El alta de sitio de construccion se implemento en QueryService con la funcion RegisterConstructionSite. La funcion ejecuta un INSERT sobre la tabla ConstructionSite y acepta datos opcionales como cliente, pais, ciudad, calle y direccion.</w:t>
+      </w:r>
+    </w:p>
+    <w:p>
+      <w:pPr>
+        <w:jc w:val="center"/>
+      </w:pPr>
+      <w:r>
+        <w:drawing>
+          <wp:inline xmlns:a="http://schemas.openxmlformats.org/drawingml/2006/main" xmlns:pic="http://schemas.openxmlformats.org/drawingml/2006/picture">
+            <wp:extent cx="5897880" cy="7411220"/>
+            <wp:docPr id="12" name="Picture 12"/>
+            <wp:cNvGraphicFramePr>
+              <a:graphicFrameLocks noChangeAspect="1"/>
+            </wp:cNvGraphicFramePr>
+            <a:graphic>
+              <a:graphicData uri="http://schemas.openxmlformats.org/drawingml/2006/picture">
+                <pic:pic>
+                  <pic:nvPicPr>
+                    <pic:cNvPr id="0" name="src_main_java_com_constructioncompany_service_QueryService_java_122_188.png"/>
+                    <pic:cNvPicPr/>
+                  </pic:nvPicPr>
+                  <pic:blipFill>
+                    <a:blip r:embed="rId20"/>
+                    <a:stretch>
+                      <a:fillRect/>
+                    </a:stretch>
+                  </pic:blipFill>
+                  <pic:spPr>
+                    <a:xfrm>
+                      <a:off x="0" y="0"/>
+                      <a:ext cx="5897880" cy="7411220"/>
+                    </a:xfrm>
+                    <a:prstGeom prst="rect"/>
+                  </pic:spPr>
+                </pic:pic>
+              </a:graphicData>
+            </a:graphic>
+          </wp:inline>
+        </w:drawing>
+      </w:r>
+    </w:p>
+    <w:p>
+      <w:pPr>
+        <w:jc w:val="center"/>
+      </w:pPr>
+      <w:r>
+        <w:rPr>
+          <w:i/>
+          <w:color w:val="5B6778"/>
+          <w:sz w:val="18"/>
+        </w:rPr>
+        <w:t>Figura 12. QueryService registra sitios de construccion en la tabla ConstructionSite.</w:t>
+      </w:r>
+    </w:p>
+    <w:p>
+      <w:r>
+        <w:t>El alta de empleado se implemento con RegisterEmployee. La funcion ejecuta un INSERT sobre Employees e incluye jefe, sitio asignado, fechas, pago actual, banco y telefono.</w:t>
+      </w:r>
+    </w:p>
+    <w:p>
+      <w:pPr>
+        <w:jc w:val="center"/>
+      </w:pPr>
+      <w:r>
+        <w:drawing>
+          <wp:inline xmlns:a="http://schemas.openxmlformats.org/drawingml/2006/main" xmlns:pic="http://schemas.openxmlformats.org/drawingml/2006/picture">
+            <wp:extent cx="5897880" cy="3473196"/>
+            <wp:docPr id="13" name="Picture 13"/>
+            <wp:cNvGraphicFramePr>
+              <a:graphicFrameLocks noChangeAspect="1"/>
+            </wp:cNvGraphicFramePr>
+            <a:graphic>
+              <a:graphicData uri="http://schemas.openxmlformats.org/drawingml/2006/picture">
+                <pic:pic>
+                  <pic:nvPicPr>
+                    <pic:cNvPr id="0" name="src_main_java_com_constructioncompany_service_QueryService_java_247_268.png"/>
+                    <pic:cNvPicPr/>
+                  </pic:nvPicPr>
+                  <pic:blipFill>
+                    <a:blip r:embed="rId21"/>
+                    <a:stretch>
+                      <a:fillRect/>
+                    </a:stretch>
+                  </pic:blipFill>
+                  <pic:spPr>
+                    <a:xfrm>
+                      <a:off x="0" y="0"/>
+                      <a:ext cx="5897880" cy="3473196"/>
+                    </a:xfrm>
+                    <a:prstGeom prst="rect"/>
+                  </pic:spPr>
+                </pic:pic>
+              </a:graphicData>
+            </a:graphic>
+          </wp:inline>
+        </w:drawing>
+      </w:r>
+    </w:p>
+    <w:p>
+      <w:pPr>
+        <w:jc w:val="center"/>
+      </w:pPr>
+      <w:r>
+        <w:rPr>
+          <w:i/>
+          <w:color w:val="5B6778"/>
+          <w:sz w:val="18"/>
+        </w:rPr>
+        <w:t>Figura 13. QueryService registra empleados en la tabla Employees.</w:t>
+      </w:r>
+    </w:p>
+    <w:p>
+      <w:r>
+        <w:t>Para soportar formularios mas flexibles se agregaron helpers que convierten campos vacios en null, fechas HTML a java.sql.Date y pago actual a BigDecimal.</w:t>
+      </w:r>
+    </w:p>
+    <w:p>
+      <w:pPr>
+        <w:jc w:val="center"/>
+      </w:pPr>
+      <w:r>
+        <w:drawing>
+          <wp:inline xmlns:a="http://schemas.openxmlformats.org/drawingml/2006/main" xmlns:pic="http://schemas.openxmlformats.org/drawingml/2006/picture">
+            <wp:extent cx="5897880" cy="2948940"/>
+            <wp:docPr id="14" name="Picture 14"/>
+            <wp:cNvGraphicFramePr>
+              <a:graphicFrameLocks noChangeAspect="1"/>
+            </wp:cNvGraphicFramePr>
+            <a:graphic>
+              <a:graphicData uri="http://schemas.openxmlformats.org/drawingml/2006/picture">
+                <pic:pic>
+                  <pic:nvPicPr>
+                    <pic:cNvPr id="0" name="src_main_java_com_constructioncompany_service_QueryService_java_484_501.png"/>
+                    <pic:cNvPicPr/>
+                  </pic:nvPicPr>
+                  <pic:blipFill>
+                    <a:blip r:embed="rId22"/>
+                    <a:stretch>
+                      <a:fillRect/>
+                    </a:stretch>
+                  </pic:blipFill>
+                  <pic:spPr>
+                    <a:xfrm>
+                      <a:off x="0" y="0"/>
+                      <a:ext cx="5897880" cy="2948940"/>
+                    </a:xfrm>
+                    <a:prstGeom prst="rect"/>
+                  </pic:spPr>
+                </pic:pic>
+              </a:graphicData>
+            </a:graphic>
+          </wp:inline>
+        </w:drawing>
+      </w:r>
+    </w:p>
+    <w:p>
+      <w:pPr>
+        <w:jc w:val="center"/>
+      </w:pPr>
+      <w:r>
+        <w:rPr>
+          <w:i/>
+          <w:color w:val="5B6778"/>
+          <w:sz w:val="18"/>
+        </w:rPr>
+        <w:t>Figura 14. Helpers para campos opcionales, fechas y valores decimales.</w:t>
+      </w:r>
+    </w:p>
     <w:sectPr>
       <w:pgSz w:w="12240" w:h="15840"/>
       <w:pgMar w:top="936" w:right="1008" w:bottom="936" w:left="1008" w:header="720" w:footer="720" w:gutter="0"/>

</xml_diff>

<commit_message>
feat: cover final project specifications
</commit_message>
<xml_diff>
--- a/Documentacion_Requisitos_Spring_Boot.docx
+++ b/Documentacion_Requisitos_Spring_Boot.docx
@@ -1608,6 +1608,770 @@
         <w:t>Figura 14. Helpers para campos opcionales, fechas y valores decimales.</w:t>
       </w:r>
     </w:p>
+    <w:p>
+      <w:r>
+        <w:br w:type="page"/>
+      </w:r>
+    </w:p>
+    <w:p>
+      <w:pPr>
+        <w:jc w:val="center"/>
+      </w:pPr>
+      <w:r>
+        <w:rPr>
+          <w:b/>
+          <w:color w:val="3F3A72"/>
+          <w:sz w:val="36"/>
+        </w:rPr>
+        <w:t>Cumplimiento de especificaciones finales</w:t>
+      </w:r>
+    </w:p>
+    <w:p>
+      <w:r>
+        <w:t>Esta seccion agrega la evidencia para las especificaciones nuevas. Redis queda fuera porque fue indicado como opcional; el resto queda implementado en el proyecto y disponible desde la aplicacion web.</w:t>
+      </w:r>
+    </w:p>
+    <w:tbl>
+      <w:tblPr>
+        <w:tblStyle w:val="TableGrid"/>
+        <w:tblW w:type="auto" w:w="0"/>
+        <w:jc w:val="center"/>
+        <w:tblLook w:firstColumn="1" w:firstRow="1" w:lastColumn="0" w:lastRow="0" w:noHBand="0" w:noVBand="1" w:val="04A0"/>
+      </w:tblPr>
+      <w:tblGrid>
+        <w:gridCol w:w="3408"/>
+        <w:gridCol w:w="3408"/>
+        <w:gridCol w:w="3408"/>
+      </w:tblGrid>
+      <w:tr>
+        <w:tc>
+          <w:tcPr>
+            <w:tcW w:type="dxa" w:w="3408"/>
+            <w:vAlign w:val="center"/>
+            <w:shd w:fill="D9DCEF"/>
+          </w:tcPr>
+          <w:p>
+            <w:r/>
+            <w:r>
+              <w:rPr>
+                <w:b/>
+                <w:sz w:val="18"/>
+              </w:rPr>
+              <w:t>Especificacion</w:t>
+            </w:r>
+          </w:p>
+        </w:tc>
+        <w:tc>
+          <w:tcPr>
+            <w:tcW w:type="dxa" w:w="3408"/>
+            <w:vAlign w:val="center"/>
+            <w:shd w:fill="D9DCEF"/>
+          </w:tcPr>
+          <w:p>
+            <w:r/>
+            <w:r>
+              <w:rPr>
+                <w:b/>
+                <w:sz w:val="18"/>
+              </w:rPr>
+              <w:t>Estado</w:t>
+            </w:r>
+          </w:p>
+        </w:tc>
+        <w:tc>
+          <w:tcPr>
+            <w:tcW w:type="dxa" w:w="3408"/>
+            <w:vAlign w:val="center"/>
+            <w:shd w:fill="D9DCEF"/>
+          </w:tcPr>
+          <w:p>
+            <w:r/>
+            <w:r>
+              <w:rPr>
+                <w:b/>
+                <w:sz w:val="18"/>
+              </w:rPr>
+              <w:t>Evidencia</w:t>
+            </w:r>
+          </w:p>
+        </w:tc>
+      </w:tr>
+      <w:tr>
+        <w:tc>
+          <w:tcPr>
+            <w:tcW w:type="dxa" w:w="3408"/>
+            <w:vAlign w:val="center"/>
+          </w:tcPr>
+          <w:p>
+            <w:r/>
+            <w:r>
+              <w:rPr>
+                <w:b w:val="0"/>
+                <w:sz w:val="18"/>
+              </w:rPr>
+              <w:t>Repositorio en GitHub</w:t>
+            </w:r>
+          </w:p>
+        </w:tc>
+        <w:tc>
+          <w:tcPr>
+            <w:tcW w:type="dxa" w:w="3408"/>
+            <w:vAlign w:val="center"/>
+          </w:tcPr>
+          <w:p>
+            <w:r/>
+            <w:r>
+              <w:rPr>
+                <w:b w:val="0"/>
+                <w:sz w:val="18"/>
+              </w:rPr>
+              <w:t>Cubierto</w:t>
+            </w:r>
+          </w:p>
+        </w:tc>
+        <w:tc>
+          <w:tcPr>
+            <w:tcW w:type="dxa" w:w="3408"/>
+            <w:vAlign w:val="center"/>
+          </w:tcPr>
+          <w:p>
+            <w:r/>
+            <w:r>
+              <w:rPr>
+                <w:b w:val="0"/>
+                <w:sz w:val="18"/>
+              </w:rPr>
+              <w:t>El proyecto esta versionado y se sube a FranBulk/Construction-Company-Spring-Boot en la rama main.</w:t>
+            </w:r>
+          </w:p>
+        </w:tc>
+      </w:tr>
+      <w:tr>
+        <w:tc>
+          <w:tcPr>
+            <w:tcW w:type="dxa" w:w="3408"/>
+            <w:vAlign w:val="center"/>
+          </w:tcPr>
+          <w:p>
+            <w:r/>
+            <w:r>
+              <w:rPr>
+                <w:b w:val="0"/>
+                <w:sz w:val="18"/>
+              </w:rPr>
+              <w:t>Spring Boot</w:t>
+            </w:r>
+          </w:p>
+        </w:tc>
+        <w:tc>
+          <w:tcPr>
+            <w:tcW w:type="dxa" w:w="3408"/>
+            <w:vAlign w:val="center"/>
+          </w:tcPr>
+          <w:p>
+            <w:r/>
+            <w:r>
+              <w:rPr>
+                <w:b w:val="0"/>
+                <w:sz w:val="18"/>
+              </w:rPr>
+              <w:t>Cubierto</w:t>
+            </w:r>
+          </w:p>
+        </w:tc>
+        <w:tc>
+          <w:tcPr>
+            <w:tcW w:type="dxa" w:w="3408"/>
+            <w:vAlign w:val="center"/>
+          </w:tcPr>
+          <w:p>
+            <w:r/>
+            <w:r>
+              <w:rPr>
+                <w:b w:val="0"/>
+                <w:sz w:val="18"/>
+              </w:rPr>
+              <w:t>La aplicacion arranca desde ConstructionCompanyApplication y usa dependencias Spring Boot en pom.xml.</w:t>
+            </w:r>
+          </w:p>
+        </w:tc>
+      </w:tr>
+      <w:tr>
+        <w:tc>
+          <w:tcPr>
+            <w:tcW w:type="dxa" w:w="3408"/>
+            <w:vAlign w:val="center"/>
+          </w:tcPr>
+          <w:p>
+            <w:r/>
+            <w:r>
+              <w:rPr>
+                <w:b w:val="0"/>
+                <w:sz w:val="18"/>
+              </w:rPr>
+              <w:t>Base de datos: altas, bajas, cambios y consultas</w:t>
+            </w:r>
+          </w:p>
+        </w:tc>
+        <w:tc>
+          <w:tcPr>
+            <w:tcW w:type="dxa" w:w="3408"/>
+            <w:vAlign w:val="center"/>
+          </w:tcPr>
+          <w:p>
+            <w:r/>
+            <w:r>
+              <w:rPr>
+                <w:b w:val="0"/>
+                <w:sz w:val="18"/>
+              </w:rPr>
+              <w:t>Cubierto</w:t>
+            </w:r>
+          </w:p>
+        </w:tc>
+        <w:tc>
+          <w:tcPr>
+            <w:tcW w:type="dxa" w:w="3408"/>
+            <w:vAlign w:val="center"/>
+          </w:tcPr>
+          <w:p>
+            <w:r/>
+            <w:r>
+              <w:rPr>
+                <w:b w:val="0"/>
+                <w:sz w:val="18"/>
+              </w:rPr>
+              <w:t>QueryService ejecuta INSERT, UPDATE, DELETE y SELECT; index.html muestra esas operaciones en los modulos.</w:t>
+            </w:r>
+          </w:p>
+        </w:tc>
+      </w:tr>
+      <w:tr>
+        <w:tc>
+          <w:tcPr>
+            <w:tcW w:type="dxa" w:w="3408"/>
+            <w:vAlign w:val="center"/>
+          </w:tcPr>
+          <w:p>
+            <w:r/>
+            <w:r>
+              <w:rPr>
+                <w:b w:val="0"/>
+                <w:sz w:val="18"/>
+              </w:rPr>
+              <w:t>Al menos 2 rutas Apache Camel</w:t>
+            </w:r>
+          </w:p>
+        </w:tc>
+        <w:tc>
+          <w:tcPr>
+            <w:tcW w:type="dxa" w:w="3408"/>
+            <w:vAlign w:val="center"/>
+          </w:tcPr>
+          <w:p>
+            <w:r/>
+            <w:r>
+              <w:rPr>
+                <w:b w:val="0"/>
+                <w:sz w:val="18"/>
+              </w:rPr>
+              <w:t>Cubierto</w:t>
+            </w:r>
+          </w:p>
+        </w:tc>
+        <w:tc>
+          <w:tcPr>
+            <w:tcW w:type="dxa" w:w="3408"/>
+            <w:vAlign w:val="center"/>
+          </w:tcPr>
+          <w:p>
+            <w:r/>
+            <w:r>
+              <w:rPr>
+                <w:b w:val="0"/>
+                <w:sz w:val="18"/>
+              </w:rPr>
+              <w:t>PaymentRoute define payment-request-consumer y payment-result-audit.</w:t>
+            </w:r>
+          </w:p>
+        </w:tc>
+      </w:tr>
+      <w:tr>
+        <w:tc>
+          <w:tcPr>
+            <w:tcW w:type="dxa" w:w="3408"/>
+            <w:vAlign w:val="center"/>
+          </w:tcPr>
+          <w:p>
+            <w:r/>
+            <w:r>
+              <w:rPr>
+                <w:b w:val="0"/>
+                <w:sz w:val="18"/>
+              </w:rPr>
+              <w:t>Plantilla estilo admin</w:t>
+            </w:r>
+          </w:p>
+        </w:tc>
+        <w:tc>
+          <w:tcPr>
+            <w:tcW w:type="dxa" w:w="3408"/>
+            <w:vAlign w:val="center"/>
+          </w:tcPr>
+          <w:p>
+            <w:r/>
+            <w:r>
+              <w:rPr>
+                <w:b w:val="0"/>
+                <w:sz w:val="18"/>
+              </w:rPr>
+              <w:t>Cubierto</w:t>
+            </w:r>
+          </w:p>
+        </w:tc>
+        <w:tc>
+          <w:tcPr>
+            <w:tcW w:type="dxa" w:w="3408"/>
+            <w:vAlign w:val="center"/>
+          </w:tcPr>
+          <w:p>
+            <w:r/>
+            <w:r>
+              <w:rPr>
+                <w:b w:val="0"/>
+                <w:sz w:val="18"/>
+              </w:rPr>
+              <w:t>index.html contiene login, encabezado, sidebar de modulos, panel de consulta y panel de resultados.</w:t>
+            </w:r>
+          </w:p>
+        </w:tc>
+      </w:tr>
+      <w:tr>
+        <w:tc>
+          <w:tcPr>
+            <w:tcW w:type="dxa" w:w="3408"/>
+            <w:vAlign w:val="center"/>
+          </w:tcPr>
+          <w:p>
+            <w:r/>
+            <w:r>
+              <w:rPr>
+                <w:b w:val="0"/>
+                <w:sz w:val="18"/>
+              </w:rPr>
+              <w:t>Conexion RabbitMQ</w:t>
+            </w:r>
+          </w:p>
+        </w:tc>
+        <w:tc>
+          <w:tcPr>
+            <w:tcW w:type="dxa" w:w="3408"/>
+            <w:vAlign w:val="center"/>
+          </w:tcPr>
+          <w:p>
+            <w:r/>
+            <w:r>
+              <w:rPr>
+                <w:b w:val="0"/>
+                <w:sz w:val="18"/>
+              </w:rPr>
+              <w:t>Cubierto</w:t>
+            </w:r>
+          </w:p>
+        </w:tc>
+        <w:tc>
+          <w:tcPr>
+            <w:tcW w:type="dxa" w:w="3408"/>
+            <w:vAlign w:val="center"/>
+          </w:tcPr>
+          <w:p>
+            <w:r/>
+            <w:r>
+              <w:rPr>
+                <w:b w:val="0"/>
+                <w:sz w:val="18"/>
+              </w:rPr>
+              <w:t>docker-compose.yml levanta RabbitMQ; RabbitMqConfig declara exchange, colas y bindings; PaymentRoute usa spring-rabbitmq.</w:t>
+            </w:r>
+          </w:p>
+        </w:tc>
+      </w:tr>
+      <w:tr>
+        <w:tc>
+          <w:tcPr>
+            <w:tcW w:type="dxa" w:w="3408"/>
+            <w:vAlign w:val="center"/>
+          </w:tcPr>
+          <w:p>
+            <w:r/>
+            <w:r>
+              <w:rPr>
+                <w:b w:val="0"/>
+                <w:sz w:val="18"/>
+              </w:rPr>
+              <w:t>Redis</w:t>
+            </w:r>
+          </w:p>
+        </w:tc>
+        <w:tc>
+          <w:tcPr>
+            <w:tcW w:type="dxa" w:w="3408"/>
+            <w:vAlign w:val="center"/>
+          </w:tcPr>
+          <w:p>
+            <w:r/>
+            <w:r>
+              <w:rPr>
+                <w:b w:val="0"/>
+                <w:sz w:val="18"/>
+              </w:rPr>
+              <w:t>No aplicado</w:t>
+            </w:r>
+          </w:p>
+        </w:tc>
+        <w:tc>
+          <w:tcPr>
+            <w:tcW w:type="dxa" w:w="3408"/>
+            <w:vAlign w:val="center"/>
+          </w:tcPr>
+          <w:p>
+            <w:r/>
+            <w:r>
+              <w:rPr>
+                <w:b w:val="0"/>
+                <w:sz w:val="18"/>
+              </w:rPr>
+              <w:t>La especificacion lo marca como opcional y se decidio no incluirlo.</w:t>
+            </w:r>
+          </w:p>
+        </w:tc>
+      </w:tr>
+    </w:tbl>
+    <w:p>
+      <w:pPr>
+        <w:pStyle w:val="Heading2"/>
+      </w:pPr>
+      <w:r>
+        <w:t>Manejo de base de datos: registro de operaciones</w:t>
+      </w:r>
+    </w:p>
+    <w:p>
+      <w:r>
+        <w:t>QueryService.java registra las funciones disponibles. Aqui se agregaron las operaciones de alta, cambio y baja para sitios de construccion y empleados.</w:t>
+      </w:r>
+    </w:p>
+    <w:p>
+      <w:r>
+        <w:rPr>
+          <w:b/>
+        </w:rPr>
+        <w:t>Figura 15. QueryService.java, desde linea 122.</w:t>
+      </w:r>
+    </w:p>
+    <w:p>
+      <w:r>
+        <w:drawing>
+          <wp:inline xmlns:a="http://schemas.openxmlformats.org/drawingml/2006/main" xmlns:pic="http://schemas.openxmlformats.org/drawingml/2006/picture">
+            <wp:extent cx="6035040" cy="2438818"/>
+            <wp:docPr id="15" name="Picture 15"/>
+            <wp:cNvGraphicFramePr>
+              <a:graphicFrameLocks noChangeAspect="1"/>
+            </wp:cNvGraphicFramePr>
+            <a:graphic>
+              <a:graphicData uri="http://schemas.openxmlformats.org/drawingml/2006/picture">
+                <pic:pic>
+                  <pic:nvPicPr>
+                    <pic:cNvPr id="0" name="crud-map.png"/>
+                    <pic:cNvPicPr/>
+                  </pic:nvPicPr>
+                  <pic:blipFill>
+                    <a:blip r:embed="rId23"/>
+                    <a:stretch>
+                      <a:fillRect/>
+                    </a:stretch>
+                  </pic:blipFill>
+                  <pic:spPr>
+                    <a:xfrm>
+                      <a:off x="0" y="0"/>
+                      <a:ext cx="6035040" cy="2438818"/>
+                    </a:xfrm>
+                    <a:prstGeom prst="rect"/>
+                  </pic:spPr>
+                </pic:pic>
+              </a:graphicData>
+            </a:graphic>
+          </wp:inline>
+        </w:drawing>
+      </w:r>
+    </w:p>
+    <w:p>
+      <w:pPr>
+        <w:pStyle w:val="Heading2"/>
+      </w:pPr>
+      <w:r>
+        <w:t>Cambios y bajas de sitios de construccion</w:t>
+      </w:r>
+    </w:p>
+    <w:p>
+      <w:r>
+        <w:t>El cambio usa SQL dinamico para actualizar solo los campos capturados; la baja elimina por ConstructionSite_ID.</w:t>
+      </w:r>
+    </w:p>
+    <w:p>
+      <w:r>
+        <w:rPr>
+          <w:b/>
+        </w:rPr>
+        <w:t>Figura 16. QueryService.java, desde linea 193.</w:t>
+      </w:r>
+    </w:p>
+    <w:p>
+      <w:r>
+        <w:drawing>
+          <wp:inline xmlns:a="http://schemas.openxmlformats.org/drawingml/2006/main" xmlns:pic="http://schemas.openxmlformats.org/drawingml/2006/picture">
+            <wp:extent cx="6035040" cy="2801692"/>
+            <wp:docPr id="16" name="Picture 16"/>
+            <wp:cNvGraphicFramePr>
+              <a:graphicFrameLocks noChangeAspect="1"/>
+            </wp:cNvGraphicFramePr>
+            <a:graphic>
+              <a:graphicData uri="http://schemas.openxmlformats.org/drawingml/2006/picture">
+                <pic:pic>
+                  <pic:nvPicPr>
+                    <pic:cNvPr id="0" name="site-crud.png"/>
+                    <pic:cNvPicPr/>
+                  </pic:nvPicPr>
+                  <pic:blipFill>
+                    <a:blip r:embed="rId24"/>
+                    <a:stretch>
+                      <a:fillRect/>
+                    </a:stretch>
+                  </pic:blipFill>
+                  <pic:spPr>
+                    <a:xfrm>
+                      <a:off x="0" y="0"/>
+                      <a:ext cx="6035040" cy="2801692"/>
+                    </a:xfrm>
+                    <a:prstGeom prst="rect"/>
+                  </pic:spPr>
+                </pic:pic>
+              </a:graphicData>
+            </a:graphic>
+          </wp:inline>
+        </w:drawing>
+      </w:r>
+    </w:p>
+    <w:p>
+      <w:pPr>
+        <w:pStyle w:val="Heading2"/>
+      </w:pPr>
+      <w:r>
+        <w:t>Cambios y bajas de empleados</w:t>
+      </w:r>
+    </w:p>
+    <w:p>
+      <w:r>
+        <w:t>El cambio permite modificar asignacion, salario, banco y contacto; la baja elimina por Employee_ID.</w:t>
+      </w:r>
+    </w:p>
+    <w:p>
+      <w:r>
+        <w:rPr>
+          <w:b/>
+        </w:rPr>
+        <w:t>Figura 17. QueryService.java, desde linea 295.</w:t>
+      </w:r>
+    </w:p>
+    <w:p>
+      <w:r>
+        <w:drawing>
+          <wp:inline xmlns:a="http://schemas.openxmlformats.org/drawingml/2006/main" xmlns:pic="http://schemas.openxmlformats.org/drawingml/2006/picture">
+            <wp:extent cx="6035040" cy="3950473"/>
+            <wp:docPr id="17" name="Picture 17"/>
+            <wp:cNvGraphicFramePr>
+              <a:graphicFrameLocks noChangeAspect="1"/>
+            </wp:cNvGraphicFramePr>
+            <a:graphic>
+              <a:graphicData uri="http://schemas.openxmlformats.org/drawingml/2006/picture">
+                <pic:pic>
+                  <pic:nvPicPr>
+                    <pic:cNvPr id="0" name="employee-crud.png"/>
+                    <pic:cNvPicPr/>
+                  </pic:nvPicPr>
+                  <pic:blipFill>
+                    <a:blip r:embed="rId25"/>
+                    <a:stretch>
+                      <a:fillRect/>
+                    </a:stretch>
+                  </pic:blipFill>
+                  <pic:spPr>
+                    <a:xfrm>
+                      <a:off x="0" y="0"/>
+                      <a:ext cx="6035040" cy="3950473"/>
+                    </a:xfrm>
+                    <a:prstGeom prst="rect"/>
+                  </pic:spPr>
+                </pic:pic>
+              </a:graphicData>
+            </a:graphic>
+          </wp:inline>
+        </w:drawing>
+      </w:r>
+    </w:p>
+    <w:p>
+      <w:pPr>
+        <w:pStyle w:val="Heading2"/>
+      </w:pPr>
+      <w:r>
+        <w:t>Plantilla admin en el frontend</w:t>
+      </w:r>
+    </w:p>
+    <w:p>
+      <w:r>
+        <w:t>El selector de Query muestra las nuevas acciones dentro de los modulos Construction Sites y Employees.</w:t>
+      </w:r>
+    </w:p>
+    <w:p>
+      <w:r>
+        <w:rPr>
+          <w:b/>
+        </w:rPr>
+        <w:t>Figura 18. index.html, desde linea 423.</w:t>
+      </w:r>
+    </w:p>
+    <w:p>
+      <w:r>
+        <w:drawing>
+          <wp:inline xmlns:a="http://schemas.openxmlformats.org/drawingml/2006/main" xmlns:pic="http://schemas.openxmlformats.org/drawingml/2006/picture">
+            <wp:extent cx="6035040" cy="5237635"/>
+            <wp:docPr id="18" name="Picture 18"/>
+            <wp:cNvGraphicFramePr>
+              <a:graphicFrameLocks noChangeAspect="1"/>
+            </wp:cNvGraphicFramePr>
+            <a:graphic>
+              <a:graphicData uri="http://schemas.openxmlformats.org/drawingml/2006/picture">
+                <pic:pic>
+                  <pic:nvPicPr>
+                    <pic:cNvPr id="0" name="crud-ui.png"/>
+                    <pic:cNvPicPr/>
+                  </pic:nvPicPr>
+                  <pic:blipFill>
+                    <a:blip r:embed="rId26"/>
+                    <a:stretch>
+                      <a:fillRect/>
+                    </a:stretch>
+                  </pic:blipFill>
+                  <pic:spPr>
+                    <a:xfrm>
+                      <a:off x="0" y="0"/>
+                      <a:ext cx="6035040" cy="5237635"/>
+                    </a:xfrm>
+                    <a:prstGeom prst="rect"/>
+                  </pic:spPr>
+                </pic:pic>
+              </a:graphicData>
+            </a:graphic>
+          </wp:inline>
+        </w:drawing>
+      </w:r>
+    </w:p>
+    <w:p>
+      <w:pPr>
+        <w:pStyle w:val="Heading2"/>
+      </w:pPr>
+      <w:r>
+        <w:t>Dos rutas de Apache Camel con RabbitMQ</w:t>
+      </w:r>
+    </w:p>
+    <w:p>
+      <w:r>
+        <w:t>La primera ruta consume solicitudes de pago y publica resultados; la segunda consume los resultados para auditoria/log.</w:t>
+      </w:r>
+    </w:p>
+    <w:p>
+      <w:r>
+        <w:rPr>
+          <w:b/>
+        </w:rPr>
+        <w:t>Figura 19. PaymentRoute.java, desde linea 22.</w:t>
+      </w:r>
+    </w:p>
+    <w:p>
+      <w:r>
+        <w:drawing>
+          <wp:inline xmlns:a="http://schemas.openxmlformats.org/drawingml/2006/main" xmlns:pic="http://schemas.openxmlformats.org/drawingml/2006/picture">
+            <wp:extent cx="6035040" cy="4295462"/>
+            <wp:docPr id="19" name="Picture 19"/>
+            <wp:cNvGraphicFramePr>
+              <a:graphicFrameLocks noChangeAspect="1"/>
+            </wp:cNvGraphicFramePr>
+            <a:graphic>
+              <a:graphicData uri="http://schemas.openxmlformats.org/drawingml/2006/picture">
+                <pic:pic>
+                  <pic:nvPicPr>
+                    <pic:cNvPr id="0" name="camel-routes.png"/>
+                    <pic:cNvPicPr/>
+                  </pic:nvPicPr>
+                  <pic:blipFill>
+                    <a:blip r:embed="rId27"/>
+                    <a:stretch>
+                      <a:fillRect/>
+                    </a:stretch>
+                  </pic:blipFill>
+                  <pic:spPr>
+                    <a:xfrm>
+                      <a:off x="0" y="0"/>
+                      <a:ext cx="6035040" cy="4295462"/>
+                    </a:xfrm>
+                    <a:prstGeom prst="rect"/>
+                  </pic:spPr>
+                </pic:pic>
+              </a:graphicData>
+            </a:graphic>
+          </wp:inline>
+        </w:drawing>
+      </w:r>
+    </w:p>
+    <w:p>
+      <w:pPr>
+        <w:pStyle w:val="Heading2"/>
+      </w:pPr>
+      <w:r>
+        <w:t>Pruebas realizadas</w:t>
+      </w:r>
+    </w:p>
+    <w:p>
+      <w:pPr>
+        <w:pStyle w:val="ListBullet"/>
+      </w:pPr>
+      <w:r>
+        <w:t>Build Docker completado con mvn -DskipTests package dentro del Dockerfile.</w:t>
+      </w:r>
+    </w:p>
+    <w:p>
+      <w:pPr>
+        <w:pStyle w:val="ListBullet"/>
+      </w:pPr>
+      <w:r>
+        <w:t>Health check respondio UP con database UP despues de iniciar OracleServiceXE.</w:t>
+      </w:r>
+    </w:p>
+    <w:p>
+      <w:pPr>
+        <w:pStyle w:val="ListBullet"/>
+      </w:pPr>
+      <w:r>
+        <w:t>Se probaron alta, cambio, consulta y baja con registros temporales CS_CRUD_01 y E_CRUD_01; al final fueron eliminados.</w:t>
+      </w:r>
+    </w:p>
+    <w:p>
+      <w:pPr>
+        <w:pStyle w:val="ListBullet"/>
+      </w:pPr>
+      <w:r>
+        <w:t>Los logs de Spring Boot confirmaron: Routes startup (total:2), payment-request-consumer y payment-result-audit.</w:t>
+      </w:r>
+    </w:p>
     <w:sectPr>
       <w:pgSz w:w="12240" w:h="15840"/>
       <w:pgMar w:top="936" w:right="1008" w:bottom="936" w:left="1008" w:header="720" w:footer="720" w:gutter="0"/>

</xml_diff>

<commit_message>
docs: add usage guide and app screenshots
</commit_message>
<xml_diff>
--- a/Documentacion_Requisitos_Spring_Boot.docx
+++ b/Documentacion_Requisitos_Spring_Boot.docx
@@ -2372,6 +2372,786 @@
         <w:t>Los logs de Spring Boot confirmaron: Routes startup (total:2), payment-request-consumer y payment-result-audit.</w:t>
       </w:r>
     </w:p>
+    <w:p>
+      <w:r>
+        <w:br w:type="page"/>
+      </w:r>
+    </w:p>
+    <w:p>
+      <w:pPr>
+        <w:jc w:val="center"/>
+      </w:pPr>
+      <w:r>
+        <w:rPr>
+          <w:b/>
+          <w:color w:val="3F3A72"/>
+          <w:sz w:val="36"/>
+        </w:rPr>
+        <w:t>Guia de uso del sistema</w:t>
+      </w:r>
+    </w:p>
+    <w:p>
+      <w:r>
+        <w:t>Esta guia explica como iniciar el proyecto, que credenciales se usan y como ejecutar consultas desde la plantilla administrativa del sistema Duo Builders.</w:t>
+      </w:r>
+    </w:p>
+    <w:p>
+      <w:pPr>
+        <w:pStyle w:val="Heading2"/>
+      </w:pPr>
+      <w:r>
+        <w:t>Inicio del proyecto</w:t>
+      </w:r>
+    </w:p>
+    <w:p>
+      <w:pPr>
+        <w:pStyle w:val="ListNumber"/>
+      </w:pPr>
+      <w:r>
+        <w:t>Abrir la carpeta del proyecto Construction-Company.</w:t>
+      </w:r>
+    </w:p>
+    <w:p>
+      <w:pPr>
+        <w:pStyle w:val="ListNumber"/>
+      </w:pPr>
+      <w:r>
+        <w:t>Ejecutar el archivo run_spring_boot_app.bat. Este archivo intenta abrir Docker Desktop si no esta activo, construye los contenedores con Docker Compose y espera hasta que Spring Boot, RabbitMQ y Oracle esten listos.</w:t>
+      </w:r>
+    </w:p>
+    <w:p>
+      <w:pPr>
+        <w:pStyle w:val="ListNumber"/>
+      </w:pPr>
+      <w:r>
+        <w:t>Cuando la consola muestre Project is ready, abrir el enlace del frontend: http://127.0.0.1:8080/.</w:t>
+      </w:r>
+    </w:p>
+    <w:p>
+      <w:pPr>
+        <w:pStyle w:val="ListNumber"/>
+      </w:pPr>
+      <w:r>
+        <w:t>Para apagar el sistema, ejecutar stop_spring_boot_app.bat desde la misma carpeta.</w:t>
+      </w:r>
+    </w:p>
+    <w:tbl>
+      <w:tblPr>
+        <w:tblStyle w:val="TableGrid"/>
+        <w:tblW w:type="auto" w:w="0"/>
+        <w:jc w:val="center"/>
+        <w:tblLook w:firstColumn="1" w:firstRow="1" w:lastColumn="0" w:lastRow="0" w:noHBand="0" w:noVBand="1" w:val="04A0"/>
+      </w:tblPr>
+      <w:tblGrid>
+        <w:gridCol w:w="5112"/>
+        <w:gridCol w:w="5112"/>
+      </w:tblGrid>
+      <w:tr>
+        <w:tc>
+          <w:tcPr>
+            <w:tcW w:type="dxa" w:w="5112"/>
+            <w:vAlign w:val="center"/>
+            <w:shd w:fill="D9DCEF"/>
+          </w:tcPr>
+          <w:p>
+            <w:r/>
+            <w:r>
+              <w:rPr>
+                <w:b/>
+                <w:sz w:val="18"/>
+              </w:rPr>
+              <w:t>Archivo</w:t>
+            </w:r>
+          </w:p>
+        </w:tc>
+        <w:tc>
+          <w:tcPr>
+            <w:tcW w:type="dxa" w:w="5112"/>
+            <w:vAlign w:val="center"/>
+            <w:shd w:fill="D9DCEF"/>
+          </w:tcPr>
+          <w:p>
+            <w:r/>
+            <w:r>
+              <w:rPr>
+                <w:b/>
+                <w:sz w:val="18"/>
+              </w:rPr>
+              <w:t>Uso</w:t>
+            </w:r>
+          </w:p>
+        </w:tc>
+      </w:tr>
+      <w:tr>
+        <w:tc>
+          <w:tcPr>
+            <w:tcW w:type="dxa" w:w="5112"/>
+            <w:vAlign w:val="center"/>
+          </w:tcPr>
+          <w:p>
+            <w:r/>
+            <w:r>
+              <w:rPr>
+                <w:b w:val="0"/>
+                <w:sz w:val="18"/>
+              </w:rPr>
+              <w:t>run_spring_boot_app.bat</w:t>
+            </w:r>
+          </w:p>
+        </w:tc>
+        <w:tc>
+          <w:tcPr>
+            <w:tcW w:type="dxa" w:w="5112"/>
+            <w:vAlign w:val="center"/>
+          </w:tcPr>
+          <w:p>
+            <w:r/>
+            <w:r>
+              <w:rPr>
+                <w:b w:val="0"/>
+                <w:sz w:val="18"/>
+              </w:rPr>
+              <w:t>Inicia Docker Desktop si hace falta, levanta RabbitMQ y Spring Boot, espera el health check y muestra el link del frontend.</w:t>
+            </w:r>
+          </w:p>
+        </w:tc>
+      </w:tr>
+      <w:tr>
+        <w:tc>
+          <w:tcPr>
+            <w:tcW w:type="dxa" w:w="5112"/>
+            <w:vAlign w:val="center"/>
+          </w:tcPr>
+          <w:p>
+            <w:r/>
+            <w:r>
+              <w:rPr>
+                <w:b w:val="0"/>
+                <w:sz w:val="18"/>
+              </w:rPr>
+              <w:t>stop_spring_boot_app.bat</w:t>
+            </w:r>
+          </w:p>
+        </w:tc>
+        <w:tc>
+          <w:tcPr>
+            <w:tcW w:type="dxa" w:w="5112"/>
+            <w:vAlign w:val="center"/>
+          </w:tcPr>
+          <w:p>
+            <w:r/>
+            <w:r>
+              <w:rPr>
+                <w:b w:val="0"/>
+                <w:sz w:val="18"/>
+              </w:rPr>
+              <w:t>Apaga los contenedores del proyecto con docker compose down.</w:t>
+            </w:r>
+          </w:p>
+        </w:tc>
+      </w:tr>
+    </w:tbl>
+    <w:p>
+      <w:pPr>
+        <w:pStyle w:val="Heading2"/>
+      </w:pPr>
+      <w:r>
+        <w:t>Credenciales y enlaces</w:t>
+      </w:r>
+    </w:p>
+    <w:tbl>
+      <w:tblPr>
+        <w:tblStyle w:val="TableGrid"/>
+        <w:tblW w:type="auto" w:w="0"/>
+        <w:jc w:val="center"/>
+        <w:tblLook w:firstColumn="1" w:firstRow="1" w:lastColumn="0" w:lastRow="0" w:noHBand="0" w:noVBand="1" w:val="04A0"/>
+      </w:tblPr>
+      <w:tblGrid>
+        <w:gridCol w:w="2556"/>
+        <w:gridCol w:w="2556"/>
+        <w:gridCol w:w="2556"/>
+        <w:gridCol w:w="2556"/>
+      </w:tblGrid>
+      <w:tr>
+        <w:tc>
+          <w:tcPr>
+            <w:tcW w:type="dxa" w:w="2556"/>
+            <w:vAlign w:val="center"/>
+            <w:shd w:fill="D9DCEF"/>
+          </w:tcPr>
+          <w:p>
+            <w:r/>
+            <w:r>
+              <w:rPr>
+                <w:b/>
+                <w:sz w:val="18"/>
+              </w:rPr>
+              <w:t>Servicio</w:t>
+            </w:r>
+          </w:p>
+        </w:tc>
+        <w:tc>
+          <w:tcPr>
+            <w:tcW w:type="dxa" w:w="2556"/>
+            <w:vAlign w:val="center"/>
+            <w:shd w:fill="D9DCEF"/>
+          </w:tcPr>
+          <w:p>
+            <w:r/>
+            <w:r>
+              <w:rPr>
+                <w:b/>
+                <w:sz w:val="18"/>
+              </w:rPr>
+              <w:t>URL / dato</w:t>
+            </w:r>
+          </w:p>
+        </w:tc>
+        <w:tc>
+          <w:tcPr>
+            <w:tcW w:type="dxa" w:w="2556"/>
+            <w:vAlign w:val="center"/>
+            <w:shd w:fill="D9DCEF"/>
+          </w:tcPr>
+          <w:p>
+            <w:r/>
+            <w:r>
+              <w:rPr>
+                <w:b/>
+                <w:sz w:val="18"/>
+              </w:rPr>
+              <w:t>Usuario</w:t>
+            </w:r>
+          </w:p>
+        </w:tc>
+        <w:tc>
+          <w:tcPr>
+            <w:tcW w:type="dxa" w:w="2556"/>
+            <w:vAlign w:val="center"/>
+            <w:shd w:fill="D9DCEF"/>
+          </w:tcPr>
+          <w:p>
+            <w:r/>
+            <w:r>
+              <w:rPr>
+                <w:b/>
+                <w:sz w:val="18"/>
+              </w:rPr>
+              <w:t>Contrasena</w:t>
+            </w:r>
+          </w:p>
+        </w:tc>
+      </w:tr>
+      <w:tr>
+        <w:tc>
+          <w:tcPr>
+            <w:tcW w:type="dxa" w:w="2556"/>
+            <w:vAlign w:val="center"/>
+          </w:tcPr>
+          <w:p>
+            <w:r/>
+            <w:r>
+              <w:rPr>
+                <w:b w:val="0"/>
+                <w:sz w:val="18"/>
+              </w:rPr>
+              <w:t>Aplicacion web</w:t>
+            </w:r>
+          </w:p>
+        </w:tc>
+        <w:tc>
+          <w:tcPr>
+            <w:tcW w:type="dxa" w:w="2556"/>
+            <w:vAlign w:val="center"/>
+          </w:tcPr>
+          <w:p>
+            <w:r/>
+            <w:r>
+              <w:rPr>
+                <w:b w:val="0"/>
+                <w:sz w:val="18"/>
+              </w:rPr>
+              <w:t>http://127.0.0.1:8080/</w:t>
+            </w:r>
+          </w:p>
+        </w:tc>
+        <w:tc>
+          <w:tcPr>
+            <w:tcW w:type="dxa" w:w="2556"/>
+            <w:vAlign w:val="center"/>
+          </w:tcPr>
+          <w:p>
+            <w:r/>
+            <w:r>
+              <w:rPr>
+                <w:b w:val="0"/>
+                <w:sz w:val="18"/>
+              </w:rPr>
+              <w:t>admin</w:t>
+            </w:r>
+          </w:p>
+        </w:tc>
+        <w:tc>
+          <w:tcPr>
+            <w:tcW w:type="dxa" w:w="2556"/>
+            <w:vAlign w:val="center"/>
+          </w:tcPr>
+          <w:p>
+            <w:r/>
+            <w:r>
+              <w:rPr>
+                <w:b w:val="0"/>
+                <w:sz w:val="18"/>
+              </w:rPr>
+              <w:t>admin</w:t>
+            </w:r>
+          </w:p>
+        </w:tc>
+      </w:tr>
+      <w:tr>
+        <w:tc>
+          <w:tcPr>
+            <w:tcW w:type="dxa" w:w="2556"/>
+            <w:vAlign w:val="center"/>
+          </w:tcPr>
+          <w:p>
+            <w:r/>
+            <w:r>
+              <w:rPr>
+                <w:b w:val="0"/>
+                <w:sz w:val="18"/>
+              </w:rPr>
+              <w:t>RabbitMQ Management</w:t>
+            </w:r>
+          </w:p>
+        </w:tc>
+        <w:tc>
+          <w:tcPr>
+            <w:tcW w:type="dxa" w:w="2556"/>
+            <w:vAlign w:val="center"/>
+          </w:tcPr>
+          <w:p>
+            <w:r/>
+            <w:r>
+              <w:rPr>
+                <w:b w:val="0"/>
+                <w:sz w:val="18"/>
+              </w:rPr>
+              <w:t>http://127.0.0.1:15672/</w:t>
+            </w:r>
+          </w:p>
+        </w:tc>
+        <w:tc>
+          <w:tcPr>
+            <w:tcW w:type="dxa" w:w="2556"/>
+            <w:vAlign w:val="center"/>
+          </w:tcPr>
+          <w:p>
+            <w:r/>
+            <w:r>
+              <w:rPr>
+                <w:b w:val="0"/>
+                <w:sz w:val="18"/>
+              </w:rPr>
+              <w:t>guest</w:t>
+            </w:r>
+          </w:p>
+        </w:tc>
+        <w:tc>
+          <w:tcPr>
+            <w:tcW w:type="dxa" w:w="2556"/>
+            <w:vAlign w:val="center"/>
+          </w:tcPr>
+          <w:p>
+            <w:r/>
+            <w:r>
+              <w:rPr>
+                <w:b w:val="0"/>
+                <w:sz w:val="18"/>
+              </w:rPr>
+              <w:t>guest</w:t>
+            </w:r>
+          </w:p>
+        </w:tc>
+      </w:tr>
+      <w:tr>
+        <w:tc>
+          <w:tcPr>
+            <w:tcW w:type="dxa" w:w="2556"/>
+            <w:vAlign w:val="center"/>
+          </w:tcPr>
+          <w:p>
+            <w:r/>
+            <w:r>
+              <w:rPr>
+                <w:b w:val="0"/>
+                <w:sz w:val="18"/>
+              </w:rPr>
+              <w:t>Base de datos Oracle</w:t>
+            </w:r>
+          </w:p>
+        </w:tc>
+        <w:tc>
+          <w:tcPr>
+            <w:tcW w:type="dxa" w:w="2556"/>
+            <w:vAlign w:val="center"/>
+          </w:tcPr>
+          <w:p>
+            <w:r/>
+            <w:r>
+              <w:rPr>
+                <w:b w:val="0"/>
+                <w:sz w:val="18"/>
+              </w:rPr>
+              <w:t>jdbc:oracle:thin:@localhost:1521/XEPDB1</w:t>
+            </w:r>
+          </w:p>
+        </w:tc>
+        <w:tc>
+          <w:tcPr>
+            <w:tcW w:type="dxa" w:w="2556"/>
+            <w:vAlign w:val="center"/>
+          </w:tcPr>
+          <w:p>
+            <w:r/>
+            <w:r>
+              <w:rPr>
+                <w:b w:val="0"/>
+                <w:sz w:val="18"/>
+              </w:rPr>
+              <w:t>ConstructionCompany</w:t>
+            </w:r>
+          </w:p>
+        </w:tc>
+        <w:tc>
+          <w:tcPr>
+            <w:tcW w:type="dxa" w:w="2556"/>
+            <w:vAlign w:val="center"/>
+          </w:tcPr>
+          <w:p>
+            <w:r/>
+            <w:r>
+              <w:rPr>
+                <w:b w:val="0"/>
+                <w:sz w:val="18"/>
+              </w:rPr>
+              <w:t>const123</w:t>
+            </w:r>
+          </w:p>
+        </w:tc>
+      </w:tr>
+      <w:tr>
+        <w:tc>
+          <w:tcPr>
+            <w:tcW w:type="dxa" w:w="2556"/>
+            <w:vAlign w:val="center"/>
+          </w:tcPr>
+          <w:p>
+            <w:r/>
+            <w:r>
+              <w:rPr>
+                <w:b w:val="0"/>
+                <w:sz w:val="18"/>
+              </w:rPr>
+              <w:t>Oracle desde Docker</w:t>
+            </w:r>
+          </w:p>
+        </w:tc>
+        <w:tc>
+          <w:tcPr>
+            <w:tcW w:type="dxa" w:w="2556"/>
+            <w:vAlign w:val="center"/>
+          </w:tcPr>
+          <w:p>
+            <w:r/>
+            <w:r>
+              <w:rPr>
+                <w:b w:val="0"/>
+                <w:sz w:val="18"/>
+              </w:rPr>
+              <w:t>jdbc:oracle:thin:@host.docker.internal:1521/XEPDB1</w:t>
+            </w:r>
+          </w:p>
+        </w:tc>
+        <w:tc>
+          <w:tcPr>
+            <w:tcW w:type="dxa" w:w="2556"/>
+            <w:vAlign w:val="center"/>
+          </w:tcPr>
+          <w:p>
+            <w:r/>
+            <w:r>
+              <w:rPr>
+                <w:b w:val="0"/>
+                <w:sz w:val="18"/>
+              </w:rPr>
+              <w:t>ConstructionCompany</w:t>
+            </w:r>
+          </w:p>
+        </w:tc>
+        <w:tc>
+          <w:tcPr>
+            <w:tcW w:type="dxa" w:w="2556"/>
+            <w:vAlign w:val="center"/>
+          </w:tcPr>
+          <w:p>
+            <w:r/>
+            <w:r>
+              <w:rPr>
+                <w:b w:val="0"/>
+                <w:sz w:val="18"/>
+              </w:rPr>
+              <w:t>const123</w:t>
+            </w:r>
+          </w:p>
+        </w:tc>
+      </w:tr>
+    </w:tbl>
+    <w:p>
+      <w:r>
+        <w:t>La aplicacion usa las credenciales de Oracle y RabbitMQ automaticamente desde application.yml y docker-compose.yml. El usuario solo necesita iniciar sesion en la pagina con admin/admin.</w:t>
+      </w:r>
+    </w:p>
+    <w:p>
+      <w:pPr>
+        <w:pStyle w:val="Heading2"/>
+      </w:pPr>
+      <w:r>
+        <w:t>Uso dentro de la aplicacion</w:t>
+      </w:r>
+    </w:p>
+    <w:p>
+      <w:pPr>
+        <w:pStyle w:val="ListNumber"/>
+      </w:pPr>
+      <w:r>
+        <w:t>En la pantalla de login escribir usuario admin y contrasena admin.</w:t>
+      </w:r>
+    </w:p>
+    <w:p>
+      <w:pPr>
+        <w:pStyle w:val="ListNumber"/>
+      </w:pPr>
+      <w:r>
+        <w:t>Seleccionar un modulo en la barra lateral, por ejemplo Construction Sites, Employees, Payments o Payroll Payment.</w:t>
+      </w:r>
+    </w:p>
+    <w:p>
+      <w:pPr>
+        <w:pStyle w:val="ListNumber"/>
+      </w:pPr>
+      <w:r>
+        <w:t>Elegir una opcion en el selector Query. Cada opcion muestra los campos necesarios para esa consulta u operacion.</w:t>
+      </w:r>
+    </w:p>
+    <w:p>
+      <w:pPr>
+        <w:pStyle w:val="ListNumber"/>
+      </w:pPr>
+      <w:r>
+        <w:t>Capturar los datos solicitados y presionar Run Query.</w:t>
+      </w:r>
+    </w:p>
+    <w:p>
+      <w:pPr>
+        <w:pStyle w:val="ListNumber"/>
+      </w:pPr>
+      <w:r>
+        <w:t>Leer el resultado en el panel Results. El boton Copy copia el resultado y Clear limpia el panel.</w:t>
+      </w:r>
+    </w:p>
+    <w:p>
+      <w:pPr>
+        <w:pStyle w:val="ListNumber"/>
+      </w:pPr>
+      <w:r>
+        <w:t>Para salir de la sesion, presionar Logout.</w:t>
+      </w:r>
+    </w:p>
+    <w:p>
+      <w:pPr>
+        <w:pStyle w:val="Heading2"/>
+      </w:pPr>
+      <w:r>
+        <w:t>Capturas del programa en ejecucion</w:t>
+      </w:r>
+    </w:p>
+    <w:p>
+      <w:r>
+        <w:rPr>
+          <w:b/>
+        </w:rPr>
+        <w:t>Figura 20. Pantalla inicial de login del sistema.</w:t>
+      </w:r>
+    </w:p>
+    <w:p>
+      <w:r>
+        <w:drawing>
+          <wp:inline xmlns:a="http://schemas.openxmlformats.org/drawingml/2006/main" xmlns:pic="http://schemas.openxmlformats.org/drawingml/2006/picture">
+            <wp:extent cx="6035040" cy="3976234"/>
+            <wp:docPr id="20" name="Picture 20"/>
+            <wp:cNvGraphicFramePr>
+              <a:graphicFrameLocks noChangeAspect="1"/>
+            </wp:cNvGraphicFramePr>
+            <a:graphic>
+              <a:graphicData uri="http://schemas.openxmlformats.org/drawingml/2006/picture">
+                <pic:pic>
+                  <pic:nvPicPr>
+                    <pic:cNvPr id="0" name="01-login.png"/>
+                    <pic:cNvPicPr/>
+                  </pic:nvPicPr>
+                  <pic:blipFill>
+                    <a:blip r:embed="rId28"/>
+                    <a:stretch>
+                      <a:fillRect/>
+                    </a:stretch>
+                  </pic:blipFill>
+                  <pic:spPr>
+                    <a:xfrm>
+                      <a:off x="0" y="0"/>
+                      <a:ext cx="6035040" cy="3976234"/>
+                    </a:xfrm>
+                    <a:prstGeom prst="rect"/>
+                  </pic:spPr>
+                </pic:pic>
+              </a:graphicData>
+            </a:graphic>
+          </wp:inline>
+        </w:drawing>
+      </w:r>
+    </w:p>
+    <w:p>
+      <w:r>
+        <w:rPr>
+          <w:b/>
+        </w:rPr>
+        <w:t>Figura 21. Panel principal despues de iniciar sesion con los modulos administrativos.</w:t>
+      </w:r>
+    </w:p>
+    <w:p>
+      <w:r>
+        <w:drawing>
+          <wp:inline xmlns:a="http://schemas.openxmlformats.org/drawingml/2006/main" xmlns:pic="http://schemas.openxmlformats.org/drawingml/2006/picture">
+            <wp:extent cx="6035040" cy="4219226"/>
+            <wp:docPr id="21" name="Picture 21"/>
+            <wp:cNvGraphicFramePr>
+              <a:graphicFrameLocks noChangeAspect="1"/>
+            </wp:cNvGraphicFramePr>
+            <a:graphic>
+              <a:graphicData uri="http://schemas.openxmlformats.org/drawingml/2006/picture">
+                <pic:pic>
+                  <pic:nvPicPr>
+                    <pic:cNvPr id="0" name="02-panel-principal.png"/>
+                    <pic:cNvPicPr/>
+                  </pic:nvPicPr>
+                  <pic:blipFill>
+                    <a:blip r:embed="rId29"/>
+                    <a:stretch>
+                      <a:fillRect/>
+                    </a:stretch>
+                  </pic:blipFill>
+                  <pic:spPr>
+                    <a:xfrm>
+                      <a:off x="0" y="0"/>
+                      <a:ext cx="6035040" cy="4219226"/>
+                    </a:xfrm>
+                    <a:prstGeom prst="rect"/>
+                  </pic:spPr>
+                </pic:pic>
+              </a:graphicData>
+            </a:graphic>
+          </wp:inline>
+        </w:drawing>
+      </w:r>
+    </w:p>
+    <w:p>
+      <w:r>
+        <w:rPr>
+          <w:b/>
+        </w:rPr>
+        <w:t>Figura 22. Ejecucion de una consulta de sitio de construccion desde el modulo Construction Sites.</w:t>
+      </w:r>
+    </w:p>
+    <w:p>
+      <w:r>
+        <w:drawing>
+          <wp:inline xmlns:a="http://schemas.openxmlformats.org/drawingml/2006/main" xmlns:pic="http://schemas.openxmlformats.org/drawingml/2006/picture">
+            <wp:extent cx="6035040" cy="3976234"/>
+            <wp:docPr id="22" name="Picture 22"/>
+            <wp:cNvGraphicFramePr>
+              <a:graphicFrameLocks noChangeAspect="1"/>
+            </wp:cNvGraphicFramePr>
+            <a:graphic>
+              <a:graphicData uri="http://schemas.openxmlformats.org/drawingml/2006/picture">
+                <pic:pic>
+                  <pic:nvPicPr>
+                    <pic:cNvPr id="0" name="03-consulta-sitio.png"/>
+                    <pic:cNvPicPr/>
+                  </pic:nvPicPr>
+                  <pic:blipFill>
+                    <a:blip r:embed="rId30"/>
+                    <a:stretch>
+                      <a:fillRect/>
+                    </a:stretch>
+                  </pic:blipFill>
+                  <pic:spPr>
+                    <a:xfrm>
+                      <a:off x="0" y="0"/>
+                      <a:ext cx="6035040" cy="3976234"/>
+                    </a:xfrm>
+                    <a:prstGeom prst="rect"/>
+                  </pic:spPr>
+                </pic:pic>
+              </a:graphicData>
+            </a:graphic>
+          </wp:inline>
+        </w:drawing>
+      </w:r>
+    </w:p>
+    <w:p>
+      <w:r>
+        <w:rPr>
+          <w:b/>
+        </w:rPr>
+        <w:t>Figura 23. Regreso al login despues de cerrar sesion.</w:t>
+      </w:r>
+    </w:p>
+    <w:p>
+      <w:r>
+        <w:drawing>
+          <wp:inline xmlns:a="http://schemas.openxmlformats.org/drawingml/2006/main" xmlns:pic="http://schemas.openxmlformats.org/drawingml/2006/picture">
+            <wp:extent cx="6035040" cy="3976234"/>
+            <wp:docPr id="23" name="Picture 23"/>
+            <wp:cNvGraphicFramePr>
+              <a:graphicFrameLocks noChangeAspect="1"/>
+            </wp:cNvGraphicFramePr>
+            <a:graphic>
+              <a:graphicData uri="http://schemas.openxmlformats.org/drawingml/2006/picture">
+                <pic:pic>
+                  <pic:nvPicPr>
+                    <pic:cNvPr id="0" name="04-logout.png"/>
+                    <pic:cNvPicPr/>
+                  </pic:nvPicPr>
+                  <pic:blipFill>
+                    <a:blip r:embed="rId31"/>
+                    <a:stretch>
+                      <a:fillRect/>
+                    </a:stretch>
+                  </pic:blipFill>
+                  <pic:spPr>
+                    <a:xfrm>
+                      <a:off x="0" y="0"/>
+                      <a:ext cx="6035040" cy="3976234"/>
+                    </a:xfrm>
+                    <a:prstGeom prst="rect"/>
+                  </pic:spPr>
+                </pic:pic>
+              </a:graphicData>
+            </a:graphic>
+          </wp:inline>
+        </w:drawing>
+      </w:r>
+    </w:p>
     <w:sectPr>
       <w:pgSz w:w="12240" w:h="15840"/>
       <w:pgMar w:top="936" w:right="1008" w:bottom="936" w:left="1008" w:header="720" w:footer="720" w:gutter="0"/>

</xml_diff>